<commit_message>
removed link to excel file; table 1 still looks ok
</commit_message>
<xml_diff>
--- a/ms-2026-05-27.docx
+++ b/ms-2026-05-27.docx
@@ -64,29 +64,16 @@
       <w:r>
         <w:t xml:space="preserve"> Xue Ming Wu1, </w:t>
       </w:r>
-      <w:ins w:id="1" w:author="Mo Liu" w:date="2026-05-26T11:39:00Z" w16du:dateUtc="2026-05-26T15:39:00Z">
-        <w:r>
-          <w:rPr>
-            <w:rFonts w:hint="eastAsia"/>
-          </w:rPr>
-          <w:t>Ying Yang1</w:t>
-        </w:r>
-      </w:ins>
-      <w:del w:id="2" w:author="Mo Liu" w:date="2026-05-26T11:39:00Z" w16du:dateUtc="2026-05-26T15:39:00Z">
-        <w:r>
-          <w:delText>Qi Zheng</w:delText>
-        </w:r>
-        <w:r>
-          <w:rPr>
-            <w:rFonts w:hint="eastAsia"/>
-          </w:rPr>
-          <w:delText>1</w:delText>
-        </w:r>
-      </w:del>
       <w:r>
         <w:rPr>
           <w:rFonts w:hint="eastAsia"/>
         </w:rPr>
+        <w:t>Ying Yang1</w:t>
+      </w:r>
+      <w:r>
+        <w:rPr>
+          <w:rFonts w:hint="eastAsia"/>
+        </w:rPr>
         <w:t xml:space="preserve">, </w:t>
       </w:r>
       <w:r>
@@ -101,25 +88,15 @@
       <w:r>
         <w:t xml:space="preserve">, </w:t>
       </w:r>
-      <w:ins w:id="3" w:author="Mo Liu" w:date="2026-05-26T11:39:00Z" w16du:dateUtc="2026-05-26T15:39:00Z">
-        <w:r>
-          <w:t>Qi Zheng</w:t>
-        </w:r>
-        <w:r>
-          <w:rPr>
-            <w:rFonts w:hint="eastAsia"/>
-          </w:rPr>
-          <w:t>1</w:t>
-        </w:r>
-      </w:ins>
-      <w:del w:id="4" w:author="Mo Liu" w:date="2026-05-26T11:39:00Z" w16du:dateUtc="2026-05-26T15:39:00Z">
-        <w:r>
-          <w:rPr>
-            <w:rFonts w:hint="eastAsia"/>
-          </w:rPr>
-          <w:delText>Ying Yang1</w:delText>
-        </w:r>
-      </w:del>
+      <w:r>
+        <w:t>Qi Zheng</w:t>
+      </w:r>
+      <w:r>
+        <w:rPr>
+          <w:rFonts w:hint="eastAsia"/>
+        </w:rPr>
+        <w:t>1</w:t>
+      </w:r>
       <w:r>
         <w:rPr>
           <w:rFonts w:hint="eastAsia"/>
@@ -166,39 +143,18 @@
       <w:r>
         <w:t xml:space="preserve">Molecular Cancer Research Center, </w:t>
       </w:r>
-      <w:ins w:id="5" w:author="Mini Huang" w:date="2026-05-26T16:05:00Z">
-        <w:r>
-          <w:t xml:space="preserve">Zhongshan </w:t>
-        </w:r>
-      </w:ins>
-      <w:r>
-        <w:t xml:space="preserve">School of Medicine, </w:t>
-      </w:r>
-      <w:del w:id="6" w:author="Mini Huang" w:date="2026-05-26T16:05:00Z">
-        <w:r>
-          <w:delText>Shenzhen Campus of Sun Yat-</w:delText>
-        </w:r>
-        <w:r>
-          <w:rPr>
-            <w:rFonts w:hint="eastAsia"/>
-          </w:rPr>
-          <w:delText>S</w:delText>
-        </w:r>
-        <w:r>
-          <w:delText xml:space="preserve">en University, </w:delText>
-        </w:r>
-      </w:del>
-      <w:r>
-        <w:t>Sun Yat-sen University</w:t>
-      </w:r>
-      <w:ins w:id="7" w:author="Mini Huang" w:date="2026-05-26T16:05:00Z">
-        <w:r>
-          <w:t xml:space="preserve"> </w:t>
-        </w:r>
-        <w:r>
-          <w:t>Shenzhen Campus</w:t>
-        </w:r>
-      </w:ins>
+      <w:r>
+        <w:t xml:space="preserve">Zhongshan </w:t>
+      </w:r>
+      <w:r>
+        <w:t>School of Medicine, Sun Yat-sen University</w:t>
+      </w:r>
+      <w:r>
+        <w:t xml:space="preserve"> </w:t>
+      </w:r>
+      <w:r>
+        <w:t>Shenzhen Campus</w:t>
+      </w:r>
       <w:r>
         <w:t>, Shenzhen, 518107, China</w:t>
       </w:r>
@@ -599,11 +555,11 @@
         </w:rPr>
         <w:t xml:space="preserve"> </w:t>
       </w:r>
-      <w:bookmarkStart w:id="8" w:name="ZOTERO_BREF_SKWaXNETtpY0"/>
+      <w:bookmarkStart w:id="1" w:name="ZOTERO_BREF_SKWaXNETtpY0"/>
       <w:r>
         <w:t>(Alexandrov et al. 2014)</w:t>
       </w:r>
-      <w:bookmarkEnd w:id="8"/>
+      <w:bookmarkEnd w:id="1"/>
       <w:r>
         <w:rPr>
           <w:rStyle w:val="normalfirstChar"/>
@@ -697,11 +653,11 @@
       <w:r>
         <w:t xml:space="preserve"> or certain herbal medicines </w:t>
       </w:r>
-      <w:bookmarkStart w:id="9" w:name="ZOTERO_BREF_IM4gJ3yQ6hq2"/>
+      <w:bookmarkStart w:id="2" w:name="ZOTERO_BREF_IM4gJ3yQ6hq2"/>
       <w:r>
         <w:t>(Alexandrov et al. 2016; Ng et al. 2017; Dziubańska-Kusibab et al. 2020; Boot et al. 2020)</w:t>
       </w:r>
-      <w:bookmarkEnd w:id="9"/>
+      <w:bookmarkEnd w:id="2"/>
       <w:r>
         <w:t xml:space="preserve">. Mutational signature analysis provides insights into cancer etiology, prognosis, prevention, </w:t>
       </w:r>
@@ -779,11 +735,11 @@
       <w:r>
         <w:t xml:space="preserve">genomes </w:t>
       </w:r>
-      <w:bookmarkStart w:id="10" w:name="ZOTERO_BREF_97iR0u2ckHXQ"/>
+      <w:bookmarkStart w:id="3" w:name="ZOTERO_BREF_97iR0u2ckHXQ"/>
       <w:r>
         <w:t>(Boot et al. 2018; M. N. Huang et al. 2017; Kucab et al. 2019; Caipa Garcia et al. 2024; Riva et al. 2020)</w:t>
       </w:r>
-      <w:bookmarkEnd w:id="10"/>
+      <w:bookmarkEnd w:id="3"/>
       <w:r>
         <w:t>. In addition, machine learning can identify mutational signatures as latent factors that explain the patterns of mutations in large collections of somatic mutation dat</w:t>
       </w:r>
@@ -793,14 +749,14 @@
         </w:rPr>
         <w:t xml:space="preserve">a </w:t>
       </w:r>
-      <w:bookmarkStart w:id="11" w:name="ZOTERO_BREF_DDRXI6EgPLjA"/>
+      <w:bookmarkStart w:id="4" w:name="ZOTERO_BREF_DDRXI6EgPLjA"/>
       <w:r>
         <w:rPr>
           <w:rFonts w:hint="eastAsia"/>
         </w:rPr>
         <w:t>(Alexandrov et al. 2020, 2014; Nik-Zainal et al. 2012; Chen et al. 2024; Jin et al. 2024a; Koh et al. 2025; Degasperi et al. 2022)</w:t>
       </w:r>
-      <w:bookmarkEnd w:id="11"/>
+      <w:bookmarkEnd w:id="4"/>
       <w:r>
         <w:t>. For example, data mining of upper tract urothelial cancers (UTUC) from Taiwan initially identified the aristolochic acid (AA) single-base substitution (SBS) signature</w:t>
       </w:r>
@@ -810,11 +766,11 @@
         </w:rPr>
         <w:t xml:space="preserve"> </w:t>
       </w:r>
-      <w:bookmarkStart w:id="12" w:name="ZOTERO_BREF_JvwdUEeJfzJa"/>
+      <w:bookmarkStart w:id="5" w:name="ZOTERO_BREF_JvwdUEeJfzJa"/>
       <w:r>
         <w:t>(Hoang et al. 2013; Poon et al. 2013)</w:t>
       </w:r>
-      <w:bookmarkEnd w:id="12"/>
+      <w:bookmarkEnd w:id="5"/>
       <w:r>
         <w:rPr>
           <w:rFonts w:hint="eastAsia"/>
@@ -830,11 +786,11 @@
         </w:rPr>
         <w:t xml:space="preserve"> </w:t>
       </w:r>
-      <w:bookmarkStart w:id="13" w:name="ZOTERO_BREF_NhmgMLG5UTqp"/>
+      <w:bookmarkStart w:id="6" w:name="ZOTERO_BREF_NhmgMLG5UTqp"/>
       <w:r>
         <w:t>(Ng et al. 2017; Poon et al. 2015)</w:t>
       </w:r>
-      <w:bookmarkEnd w:id="13"/>
+      <w:bookmarkEnd w:id="6"/>
       <w:r>
         <w:t xml:space="preserve">. </w:t>
       </w:r>
@@ -871,11 +827,11 @@
         </w:rPr>
         <w:t xml:space="preserve"> </w:t>
       </w:r>
-      <w:bookmarkStart w:id="14" w:name="ZOTERO_BREF_F69glrCEhxC1"/>
+      <w:bookmarkStart w:id="7" w:name="ZOTERO_BREF_F69glrCEhxC1"/>
       <w:r>
         <w:t>(Chen et al. 2024)</w:t>
       </w:r>
-      <w:bookmarkEnd w:id="14"/>
+      <w:bookmarkEnd w:id="7"/>
       <w:r>
         <w:rPr>
           <w:rFonts w:hint="eastAsia"/>
@@ -888,19 +844,19 @@
         <w:lastRenderedPageBreak/>
         <w:t xml:space="preserve">Mutational signature research has tended to focus less on indel rather than SBS signatures, and symptomatic of this COSMIC v3.5 catalogs only 25 indel signatures compared to 78 SBS signatures. Nevertheless, indel signatures can yield important information for cancer classification, epidemiology, and treatment and for understanding DNA repair and mutagenic mechanisms. Examples include identification of tumors with homologous recombination deficiency or with mismatch repair deficiency </w:t>
       </w:r>
-      <w:bookmarkStart w:id="15" w:name="ZOTERO_BREF_hhD988u0jN7V"/>
+      <w:bookmarkStart w:id="8" w:name="ZOTERO_BREF_hhD988u0jN7V"/>
       <w:r>
         <w:t>(M. Huang et al. 2015; Davies et al. 2017; Koh et al. 2025)</w:t>
       </w:r>
-      <w:bookmarkEnd w:id="15"/>
+      <w:bookmarkEnd w:id="8"/>
       <w:r>
         <w:t xml:space="preserve"> and a rare indel hypermutator phenotype due to a mutation in topoisomerase 2 alpha </w:t>
       </w:r>
-      <w:bookmarkStart w:id="16" w:name="ZOTERO_BREF_D2iecPnvmjdB"/>
+      <w:bookmarkStart w:id="9" w:name="ZOTERO_BREF_D2iecPnvmjdB"/>
       <w:r>
         <w:t>(Boot et al. 2022)</w:t>
       </w:r>
-      <w:bookmarkEnd w:id="16"/>
+      <w:bookmarkEnd w:id="9"/>
       <w:r>
         <w:rPr>
           <w:rStyle w:val="normalfirstChar"/>
@@ -930,11 +886,11 @@
       <w:r>
         <w:t xml:space="preserve">and recently </w:t>
       </w:r>
-      <w:bookmarkStart w:id="17" w:name="ZOTERO_BREF_2bTJlJjriYWb"/>
+      <w:bookmarkStart w:id="10" w:name="ZOTERO_BREF_2bTJlJjriYWb"/>
       <w:r>
         <w:t>(Koh et al. 2025)</w:t>
       </w:r>
-      <w:bookmarkEnd w:id="17"/>
+      <w:bookmarkEnd w:id="10"/>
       <w:r>
         <w:t xml:space="preserve"> proposed two classification schemes, one with 89 types of indel and one with 476 types (Figure 1). </w:t>
       </w:r>
@@ -943,37 +899,37 @@
       <w:r>
         <w:t xml:space="preserve">The older, 83-type scheme primarily categorizes indels based on the number of bases inserted or deleted, and for single-base insertions and deletions the identity of the deleted or inserted base (conventionally shown as pyrimidines, C or T) </w:t>
       </w:r>
-      <w:bookmarkStart w:id="18" w:name="ZOTERO_BREF_DLfsir5mroQA"/>
+      <w:bookmarkStart w:id="11" w:name="ZOTERO_BREF_DLfsir5mroQA"/>
       <w:r>
         <w:t>(</w:t>
       </w:r>
-      <w:commentRangeStart w:id="19"/>
-      <w:commentRangeStart w:id="20"/>
+      <w:commentRangeStart w:id="12"/>
+      <w:commentRangeStart w:id="13"/>
       <w:r>
         <w:t>Rozen 2026</w:t>
       </w:r>
-      <w:commentRangeEnd w:id="20"/>
+      <w:commentRangeEnd w:id="13"/>
       <w:r>
         <w:rPr>
           <w:rStyle w:val="CommentReference"/>
           <w:sz w:val="24"/>
           <w:szCs w:val="24"/>
         </w:rPr>
-        <w:commentReference w:id="20"/>
-      </w:r>
-      <w:commentRangeEnd w:id="19"/>
+        <w:commentReference w:id="13"/>
+      </w:r>
+      <w:commentRangeEnd w:id="12"/>
       <w:r>
         <w:rPr>
           <w:rStyle w:val="CommentReference"/>
           <w:sz w:val="24"/>
           <w:szCs w:val="24"/>
         </w:rPr>
-        <w:commentReference w:id="19"/>
+        <w:commentReference w:id="12"/>
       </w:r>
       <w:r>
         <w:t>)</w:t>
       </w:r>
-      <w:bookmarkEnd w:id="18"/>
+      <w:bookmarkEnd w:id="11"/>
       <w:r>
         <w:t>. For these single-base indels, the classification also considers the number of flanking C or T residues (Figure 1A). Indels longer than 1 base are further classified by their occu</w:t>
       </w:r>
@@ -1117,11 +1073,11 @@
       <w:r>
         <w:t xml:space="preserve">One of the new classification schemes is based on 476 types of indel and one is based on 89 types, which mainly consolidates similar mutation types in the 476-type classification into coarser-grained mutation types </w:t>
       </w:r>
-      <w:bookmarkStart w:id="21" w:name="ZOTERO_BREF_6zFIi2vPZWZ4"/>
+      <w:bookmarkStart w:id="14" w:name="ZOTERO_BREF_6zFIi2vPZWZ4"/>
       <w:r>
         <w:t>(Koh et al. 2025)</w:t>
       </w:r>
-      <w:bookmarkEnd w:id="21"/>
+      <w:bookmarkEnd w:id="14"/>
       <w:r>
         <w:t xml:space="preserve"> </w:t>
       </w:r>
@@ -1360,19 +1316,19 @@
       <w:r>
         <w:t xml:space="preserve">We identified indel signatures in all three classifications from a total of 6,975 cancer genomes encompassing 32 cancer types using a method based on hierarchical Dirichlet processes  </w:t>
       </w:r>
-      <w:bookmarkStart w:id="22" w:name="ZOTERO_BREF_sXKgi2ptdMXh"/>
+      <w:bookmarkStart w:id="15" w:name="ZOTERO_BREF_sXKgi2ptdMXh"/>
       <w:r>
         <w:t>(Liu et al. 2023)</w:t>
       </w:r>
-      <w:bookmarkEnd w:id="22"/>
+      <w:bookmarkEnd w:id="15"/>
       <w:r>
         <w:t xml:space="preserve">, and a method based on non-negative matrix factorization </w:t>
       </w:r>
-      <w:bookmarkStart w:id="23" w:name="ZOTERO_BREF_Ax2rB3g50il2"/>
+      <w:bookmarkStart w:id="16" w:name="ZOTERO_BREF_Ax2rB3g50il2"/>
       <w:r>
         <w:t>(Islam et al. 2022)</w:t>
       </w:r>
-      <w:bookmarkEnd w:id="23"/>
+      <w:bookmarkEnd w:id="16"/>
       <w:r>
         <w:t xml:space="preserve">. The extracted signatures were broadly consistent between the two methods </w:t>
       </w:r>
@@ -1435,11 +1391,11 @@
         <w:lastRenderedPageBreak/>
         <w:t xml:space="preserve">signatures had tumor spectra with &gt; 0.90 similarity (Table 1). Of the 44 signatures identified in the 89-type classification, similar signatures were previously described for 18 </w:t>
       </w:r>
-      <w:bookmarkStart w:id="24" w:name="ZOTERO_BREF_DLtC4TQmbVUR"/>
+      <w:bookmarkStart w:id="17" w:name="ZOTERO_BREF_DLtC4TQmbVUR"/>
       <w:r>
         <w:t>(Koh et al. 2025)</w:t>
       </w:r>
-      <w:bookmarkEnd w:id="24"/>
+      <w:bookmarkEnd w:id="17"/>
       <w:r>
         <w:t xml:space="preserve">. </w:t>
       </w:r>
@@ -1452,11 +1408,11 @@
       <w:r>
         <w:t xml:space="preserve">We also carried out signature discovery in spectra in the 83-type classification, and discovered 34 signatures, of which 20 were similar to signatures in the COSMIC reference set, and 3 additional signatures were similar to signatures identified in </w:t>
       </w:r>
-      <w:bookmarkStart w:id="25" w:name="ZOTERO_BREF_RenPiKIXIJyQ"/>
+      <w:bookmarkStart w:id="18" w:name="ZOTERO_BREF_RenPiKIXIJyQ"/>
       <w:r>
         <w:t>(Jin et al. 2024b)</w:t>
       </w:r>
-      <w:bookmarkEnd w:id="25"/>
+      <w:bookmarkEnd w:id="18"/>
       <w:r>
         <w:t xml:space="preserve"> (Table 1).</w:t>
       </w:r>
@@ -1744,22 +1700,15 @@
       <w:r>
         <w:t xml:space="preserve">One example of the benefits of the new classification schemes is that it reveals that the most common AA-related deletions of single Ts are deletions of single Ts, while the 89-type collapses these to a single </w:t>
       </w:r>
-      <w:ins w:id="26" w:author="Mo Liu" w:date="2026-05-26T11:39:00Z" w16du:dateUtc="2026-05-26T15:39:00Z">
-        <w:r>
-          <w:t>type</w:t>
-        </w:r>
-      </w:ins>
-      <w:del w:id="27" w:author="Mo Liu" w:date="2026-05-26T11:39:00Z" w16du:dateUtc="2026-05-26T15:39:00Z">
-        <w:r>
-          <w:delText>types</w:delText>
-        </w:r>
-      </w:del>
-      <w:r>
-        <w:t xml:space="preserve"> consisting of deletions of 1 to 4 Ts in various flanking contexts. Both the 476 and the 89-type classifications show that deletions of T are most often associated with a flanking A, which one might speculate is related to the adenine adducts caused by AA. These adenine adducts are also thought to be responsible </w:t>
+      <w:r>
+        <w:t>type</w:t>
+      </w:r>
+      <w:r>
+        <w:t xml:space="preserve"> consisting of deletions of 1 to 4 Ts in various flanking contexts. Both the 476 and the 89-type classifications show that deletions of T are most often associated with a flanking A, which one might speculate is related to the adenine adducts caused by AA. These adenine adducts are also thought to be responsible for the </w:t>
       </w:r>
       <w:r>
         <w:lastRenderedPageBreak/>
-        <w:t>for the predominance of A</w:t>
+        <w:t>predominance of A</w:t>
       </w:r>
       <w:r>
         <w:rPr>
@@ -1815,8 +1764,8 @@
           <w:iCs/>
         </w:rPr>
       </w:pPr>
-      <w:commentRangeStart w:id="28"/>
-      <w:commentRangeStart w:id="29"/>
+      <w:commentRangeStart w:id="19"/>
+      <w:commentRangeStart w:id="20"/>
       <w:r>
         <w:rPr>
           <w:rFonts w:eastAsia="SimSun"/>
@@ -2065,7 +2014,7 @@
         </w:rPr>
         <w:t>; and (2) InsDel_Aα, defined by 1 bp C deletions from CT (89-category) and more specifically from GCT/TCT (476-category) motifs. Notably, InsDel_Aα is also associated with 2 bp deletions at short repeat sequences.</w:t>
       </w:r>
-      <w:commentRangeEnd w:id="29"/>
+      <w:commentRangeEnd w:id="20"/>
       <w:r>
         <w:rPr>
           <w:rStyle w:val="CommentReference"/>
@@ -2073,9 +2022,9 @@
           <w:sz w:val="24"/>
           <w:szCs w:val="24"/>
         </w:rPr>
-        <w:commentReference w:id="29"/>
-      </w:r>
-      <w:commentRangeEnd w:id="28"/>
+        <w:commentReference w:id="20"/>
+      </w:r>
+      <w:commentRangeEnd w:id="19"/>
       <w:r>
         <w:rPr>
           <w:rStyle w:val="CommentReference"/>
@@ -2083,7 +2032,7 @@
           <w:sz w:val="24"/>
           <w:szCs w:val="24"/>
         </w:rPr>
-        <w:commentReference w:id="28"/>
+        <w:commentReference w:id="19"/>
       </w:r>
     </w:p>
     <w:p>
@@ -2151,8 +2100,8 @@
           <w:szCs w:val="24"/>
         </w:rPr>
       </w:pPr>
-      <w:commentRangeStart w:id="30"/>
-      <w:commentRangeStart w:id="31"/>
+      <w:commentRangeStart w:id="21"/>
+      <w:commentRangeStart w:id="22"/>
       <w:r>
         <w:rPr>
           <w:i/>
@@ -2162,7 +2111,7 @@
         </w:rPr>
         <w:t>Associations between indel signatures and SBS signatures &lt;FOR STEVE TO REVIEW&gt;</w:t>
       </w:r>
-      <w:commentRangeEnd w:id="31"/>
+      <w:commentRangeEnd w:id="22"/>
       <w:r>
         <w:rPr>
           <w:rStyle w:val="CommentReference"/>
@@ -2171,9 +2120,9 @@
           <w:sz w:val="24"/>
           <w:szCs w:val="24"/>
         </w:rPr>
-        <w:commentReference w:id="31"/>
-      </w:r>
-      <w:commentRangeEnd w:id="30"/>
+        <w:commentReference w:id="22"/>
+      </w:r>
+      <w:commentRangeEnd w:id="21"/>
       <w:r>
         <w:rPr>
           <w:rStyle w:val="CommentReference"/>
@@ -2182,7 +2131,7 @@
           <w:sz w:val="24"/>
           <w:szCs w:val="24"/>
         </w:rPr>
-        <w:commentReference w:id="30"/>
+        <w:commentReference w:id="21"/>
       </w:r>
     </w:p>
     <w:p>
@@ -2780,11 +2729,11 @@
       <w:r>
         <w:t xml:space="preserve">Cells with RNase H2 deficiency cannot efficiently remove ribonucleotides that had previously been incorporated into genomic DNA, and this sets the stage for topoisomerase-1 (TOP1) associated mutagenesis. This was previously proposed to generate indel signature ID4 </w:t>
       </w:r>
-      <w:bookmarkStart w:id="32" w:name="ZOTERO_BREF_xeDB1zkV4c3y"/>
+      <w:bookmarkStart w:id="23" w:name="ZOTERO_BREF_xeDB1zkV4c3y"/>
       <w:r>
         <w:t>(Jin et al. 2024a; Reijns et al. 2022; Koh et al. 2025)</w:t>
       </w:r>
-      <w:bookmarkEnd w:id="32"/>
+      <w:bookmarkEnd w:id="23"/>
       <w:r>
         <w:t xml:space="preserve">. However, we detected a new indel signature, InsDel_F, which better corresponds to RNase H2 deficiency experimental data than </w:t>
       </w:r>
@@ -2829,21 +2778,13 @@
         </w:rPr>
         <w:t xml:space="preserve"> </w:t>
       </w:r>
-      <w:commentRangeStart w:id="33"/>
+      <w:commentRangeStart w:id="24"/>
       <w:r>
         <w:rPr>
           <w:rFonts w:eastAsia="SimSun" w:hint="eastAsia"/>
         </w:rPr>
         <w:t>(</w:t>
       </w:r>
-      <w:del w:id="34" w:author="Mo Liu" w:date="2026-05-26T11:39:00Z" w16du:dateUtc="2026-05-26T15:39:00Z">
-        <w:r>
-          <w:rPr>
-            <w:rFonts w:eastAsia="SimSun" w:hint="eastAsia"/>
-          </w:rPr>
-          <w:delText xml:space="preserve">DO NOT NEED: </w:delText>
-        </w:r>
-      </w:del>
       <w:r>
         <w:rPr>
           <w:rFonts w:eastAsia="SimSun" w:hint="eastAsia"/>
@@ -2851,7 +2792,7 @@
         </w:rPr>
         <w:t>Figure S5</w:t>
       </w:r>
-      <w:commentRangeEnd w:id="33"/>
+      <w:commentRangeEnd w:id="24"/>
       <w:r>
         <w:rPr>
           <w:rStyle w:val="CommentReference"/>
@@ -2859,7 +2800,7 @@
           <w:sz w:val="24"/>
           <w:szCs w:val="24"/>
         </w:rPr>
-        <w:commentReference w:id="33"/>
+        <w:commentReference w:id="24"/>
       </w:r>
       <w:r>
         <w:rPr>
@@ -3182,15 +3123,15 @@
         <w:lastRenderedPageBreak/>
         <w:t xml:space="preserve">We also investigated the genome-wide topographical features associated with indel signatures, including transcriptional strand bias, replication strand bias, genic distribution, and replication timing. </w:t>
       </w:r>
-      <w:commentRangeStart w:id="35"/>
-      <w:commentRangeStart w:id="36"/>
+      <w:commentRangeStart w:id="25"/>
+      <w:commentRangeStart w:id="26"/>
       <w:r>
         <w:rPr>
           <w:rFonts w:eastAsiaTheme="minorEastAsia"/>
         </w:rPr>
         <w:t xml:space="preserve">Notably, because the COSMIC catalog does not provide such topographical annotations for many indel signatures, our analysis in this large cohort helps fill an important gap in the current knowledge base. </w:t>
       </w:r>
-      <w:commentRangeEnd w:id="36"/>
+      <w:commentRangeEnd w:id="26"/>
       <w:r>
         <w:rPr>
           <w:rStyle w:val="CommentReference"/>
@@ -3198,9 +3139,9 @@
           <w:sz w:val="24"/>
           <w:szCs w:val="24"/>
         </w:rPr>
-        <w:commentReference w:id="36"/>
-      </w:r>
-      <w:commentRangeEnd w:id="35"/>
+        <w:commentReference w:id="26"/>
+      </w:r>
+      <w:commentRangeEnd w:id="25"/>
       <w:r>
         <w:rPr>
           <w:rStyle w:val="CommentReference"/>
@@ -3208,7 +3149,7 @@
           <w:sz w:val="24"/>
           <w:szCs w:val="24"/>
         </w:rPr>
-        <w:commentReference w:id="35"/>
+        <w:commentReference w:id="25"/>
       </w:r>
       <w:r>
         <w:rPr>
@@ -3673,44 +3614,24 @@
         </w:rPr>
         <w:t xml:space="preserve">To leverage the resolution of both the 83-type and 89-type mutational signatures, we constructed a unified 172-type reference set and applied SigProfilerAssignment to decompose the 172-type spectra in low-TMB tumors (indels &lt; 5,000). In contrast, high-TMB tumors (indels ≥ 5,000), as well as tumors where 1-bp </w:t>
       </w:r>
-      <w:ins w:id="37" w:author="Mo Liu" w:date="2026-05-26T11:39:00Z" w16du:dateUtc="2026-05-26T15:39:00Z">
-        <w:r>
-          <w:rPr>
-            <w:rFonts w:eastAsia="SimSun" w:hint="eastAsia"/>
-          </w:rPr>
-          <w:t>T</w:t>
-        </w:r>
-      </w:ins>
-      <w:del w:id="38" w:author="Mo Liu" w:date="2026-05-26T11:39:00Z" w16du:dateUtc="2026-05-26T15:39:00Z">
-        <w:r>
-          <w:rPr>
-            <w:rFonts w:eastAsia="SimSun"/>
-          </w:rPr>
-          <w:delText>thymine</w:delText>
-        </w:r>
-      </w:del>
+      <w:r>
+        <w:rPr>
+          <w:rFonts w:eastAsia="SimSun" w:hint="eastAsia"/>
+        </w:rPr>
+        <w:t>T</w:t>
+      </w:r>
       <w:r>
         <w:rPr>
           <w:rFonts w:eastAsia="SimSun"/>
         </w:rPr>
         <w:t xml:space="preserve"> insertions or deletions in at least five </w:t>
       </w:r>
-      <w:ins w:id="39" w:author="Mo Liu" w:date="2026-05-26T11:39:00Z" w16du:dateUtc="2026-05-26T15:39:00Z">
-        <w:r>
-          <w:rPr>
-            <w:rFonts w:eastAsia="SimSun" w:hint="eastAsia"/>
-          </w:rPr>
-          <w:t>poly-</w:t>
-        </w:r>
-      </w:ins>
-      <w:del w:id="40" w:author="Mo Liu" w:date="2026-05-26T11:39:00Z" w16du:dateUtc="2026-05-26T15:39:00Z">
-        <w:r>
-          <w:rPr>
-            <w:rFonts w:eastAsia="SimSun"/>
-          </w:rPr>
-          <w:delText xml:space="preserve">homopolymeric </w:delText>
-        </w:r>
-      </w:del>
+      <w:r>
+        <w:rPr>
+          <w:rFonts w:eastAsia="SimSun" w:hint="eastAsia"/>
+        </w:rPr>
+        <w:t>poly-</w:t>
+      </w:r>
       <w:r>
         <w:rPr>
           <w:rFonts w:eastAsia="SimSun"/>
@@ -3733,30 +3654,14 @@
         <w:rPr>
           <w:rFonts w:eastAsia="SimSun" w:hint="eastAsia"/>
         </w:rPr>
-        <w:t xml:space="preserve"> (Table </w:t>
-      </w:r>
-      <w:ins w:id="41" w:author="Mo Liu" w:date="2026-05-26T11:39:00Z" w16du:dateUtc="2026-05-26T15:39:00Z">
-        <w:r>
-          <w:rPr>
-            <w:rFonts w:eastAsia="SimSun" w:hint="eastAsia"/>
-          </w:rPr>
-          <w:t>S</w:t>
-        </w:r>
-        <w:r>
-          <w:rPr>
-            <w:rFonts w:eastAsia="SimSun" w:hint="eastAsia"/>
-          </w:rPr>
-          <w:t>17</w:t>
-        </w:r>
-      </w:ins>
-      <w:del w:id="42" w:author="Mo Liu" w:date="2026-05-26T11:39:00Z" w16du:dateUtc="2026-05-26T15:39:00Z">
-        <w:r>
-          <w:rPr>
-            <w:rFonts w:eastAsia="SimSun" w:hint="eastAsia"/>
-          </w:rPr>
-          <w:delText>SX</w:delText>
-        </w:r>
-      </w:del>
+        <w:t xml:space="preserve"> (Table S</w:t>
+      </w:r>
+      <w:r>
+        <w:rPr>
+          <w:rFonts w:eastAsia="SimSun" w:hint="eastAsia"/>
+        </w:rPr>
+        <w:t>17</w:t>
+      </w:r>
       <w:r>
         <w:rPr>
           <w:rFonts w:eastAsia="SimSun" w:hint="eastAsia"/>
@@ -4021,50 +3926,37 @@
       </w:r>
     </w:p>
     <w:p>
-      <w:pPr>
-        <w:rPr>
-          <w:del w:id="43" w:author="Mo Liu" w:date="2026-05-26T11:39:00Z" w16du:dateUtc="2026-05-26T15:39:00Z"/>
-        </w:rPr>
-      </w:pPr>
       <m:oMathPara>
         <m:oMath>
           <m:r>
-            <w:ins w:id="44" w:author="Mini Huang" w:date="2026-05-26T13:56:00Z">
-              <w:rPr>
-                <w:rFonts w:ascii="Cambria Math" w:hAnsi="Cambria Math"/>
-              </w:rPr>
-              <m:t>Ratio Value=</m:t>
-            </w:ins>
+            <w:rPr>
+              <w:rFonts w:ascii="Cambria Math" w:hAnsi="Cambria Math"/>
+            </w:rPr>
+            <m:t>Ratio Value=</m:t>
           </m:r>
           <m:f>
             <m:fPr>
               <m:ctrlPr>
-                <w:ins w:id="45" w:author="Mini Huang" w:date="2026-05-26T13:56:00Z">
-                  <w:rPr>
-                    <w:rFonts w:ascii="Cambria Math" w:hAnsi="Cambria Math"/>
-                    <w:i/>
-                  </w:rPr>
-                </w:ins>
+                <w:rPr>
+                  <w:rFonts w:ascii="Cambria Math" w:hAnsi="Cambria Math"/>
+                  <w:i/>
+                </w:rPr>
               </m:ctrlPr>
             </m:fPr>
             <m:num>
               <m:r>
-                <w:ins w:id="46" w:author="Mini Huang" w:date="2026-05-26T13:56:00Z">
-                  <w:rPr>
-                    <w:rFonts w:ascii="Cambria Math" w:hAnsi="Cambria Math"/>
-                  </w:rPr>
-                  <m:t>+ strand mutation counts</m:t>
-                </w:ins>
+                <w:rPr>
+                  <w:rFonts w:ascii="Cambria Math" w:hAnsi="Cambria Math"/>
+                </w:rPr>
+                <m:t>+ strand mutation counts</m:t>
               </m:r>
             </m:num>
             <m:den>
               <m:r>
-                <w:ins w:id="47" w:author="Mini Huang" w:date="2026-05-26T13:56:00Z">
-                  <w:rPr>
-                    <w:rFonts w:ascii="Cambria Math" w:hAnsi="Cambria Math"/>
-                  </w:rPr>
-                  <m:t>- strand mutation counts</m:t>
-                </w:ins>
+                <w:rPr>
+                  <w:rFonts w:ascii="Cambria Math" w:hAnsi="Cambria Math"/>
+                </w:rPr>
+                <m:t>- strand mutation counts</m:t>
               </m:r>
             </m:den>
           </m:f>
@@ -4073,8 +3965,8 @@
     </w:p>
     <w:p>
       <w:pPr>
-        <w:rPr>
-          <w:ins w:id="48" w:author="Mini Huang" w:date="2026-05-26T13:56:00Z"/>
+        <w:ind w:firstLine="0"/>
+        <w:rPr>
           <w:shd w:val="clear" w:color="auto" w:fill="FFFF00"/>
         </w:rPr>
       </w:pPr>
@@ -4084,68 +3976,45 @@
         </w:rPr>
         <w:t>Odds ratio between the ratio of real somatic indels and the ratio of simulated somatic indels was calculated</w:t>
       </w:r>
-      <w:ins w:id="49" w:author="Mini Huang" w:date="2026-05-26T13:56:00Z">
-        <w:r>
-          <w:rPr>
-            <w:shd w:val="clear" w:color="auto" w:fill="FFFF00"/>
-          </w:rPr>
-          <w:t>:</w:t>
-        </w:r>
-      </w:ins>
+      <w:r>
+        <w:rPr>
+          <w:shd w:val="clear" w:color="auto" w:fill="FFFF00"/>
+        </w:rPr>
+        <w:t xml:space="preserve"> as</w:t>
+      </w:r>
     </w:p>
     <w:p>
-      <w:pPr>
-        <w:rPr>
-          <w:del w:id="50" w:author="Mo Liu" w:date="2026-05-26T11:39:00Z" w16du:dateUtc="2026-05-26T15:39:00Z"/>
-          <w:sz w:val="20"/>
-          <w:szCs w:val="21"/>
-          <w:rPrChange w:id="51" w:author="Mini Huang" w:date="2026-05-26T13:56:00Z">
-            <w:rPr>
-              <w:del w:id="52" w:author="Mo Liu" w:date="2026-05-26T11:39:00Z" w16du:dateUtc="2026-05-26T15:39:00Z"/>
-              <w:shd w:val="clear" w:color="auto" w:fill="FFFF00"/>
-            </w:rPr>
-          </w:rPrChange>
-        </w:rPr>
-      </w:pPr>
       <m:oMathPara>
         <m:oMath>
           <m:r>
-            <w:ins w:id="53" w:author="Mini Huang" w:date="2026-05-26T13:56:00Z">
-              <w:rPr>
-                <w:rFonts w:ascii="Cambria Math" w:hAnsi="Cambria Math"/>
-              </w:rPr>
-              <m:t>Odds Ratio=</m:t>
-            </w:ins>
+            <w:rPr>
+              <w:rFonts w:ascii="Cambria Math" w:hAnsi="Cambria Math"/>
+            </w:rPr>
+            <m:t>Odds Ratio=</m:t>
           </m:r>
           <m:f>
             <m:fPr>
               <m:ctrlPr>
-                <w:ins w:id="54" w:author="Mini Huang" w:date="2026-05-26T13:56:00Z">
-                  <w:rPr>
-                    <w:rFonts w:ascii="Cambria Math" w:hAnsi="Cambria Math"/>
-                    <w:i/>
-                  </w:rPr>
-                </w:ins>
+                <w:rPr>
+                  <w:rFonts w:ascii="Cambria Math" w:hAnsi="Cambria Math"/>
+                  <w:i/>
+                </w:rPr>
               </m:ctrlPr>
             </m:fPr>
             <m:num>
               <m:r>
-                <w:ins w:id="55" w:author="Mini Huang" w:date="2026-05-26T13:56:00Z">
-                  <w:rPr>
-                    <w:rFonts w:ascii="Cambria Math" w:hAnsi="Cambria Math"/>
-                  </w:rPr>
-                  <m:t>Real Ratio Value</m:t>
-                </w:ins>
+                <w:rPr>
+                  <w:rFonts w:ascii="Cambria Math" w:hAnsi="Cambria Math"/>
+                </w:rPr>
+                <m:t>Real Ratio Value</m:t>
               </m:r>
             </m:num>
             <m:den>
               <m:r>
-                <w:ins w:id="56" w:author="Mini Huang" w:date="2026-05-26T13:56:00Z">
-                  <w:rPr>
-                    <w:rFonts w:ascii="Cambria Math" w:hAnsi="Cambria Math"/>
-                  </w:rPr>
-                  <m:t>Simulation Ratio Value</m:t>
-                </w:ins>
+                <w:rPr>
+                  <w:rFonts w:ascii="Cambria Math" w:hAnsi="Cambria Math"/>
+                </w:rPr>
+                <m:t>Simulation Ratio Value</m:t>
               </m:r>
             </m:den>
           </m:f>
@@ -4153,6 +4022,12 @@
       </m:oMathPara>
     </w:p>
     <w:p>
+      <w:pPr>
+        <w:ind w:firstLine="0"/>
+      </w:pPr>
+      <w:r>
+        <w:t xml:space="preserve">And </w:t>
+      </w:r>
       <w:r>
         <w:t>p values were calculated for the odds ratio using Fisher’s exact test. Only strand asymmetries with p value &gt; 0.05 were considered showing strand asymmetries.</w:t>
       </w:r>
@@ -4280,7 +4155,6 @@
     <w:p>
       <w:pPr>
         <w:rPr>
-          <w:ins w:id="57" w:author="Mini Huang" w:date="2026-05-26T15:34:00Z"/>
           <w:sz w:val="20"/>
           <w:szCs w:val="21"/>
         </w:rPr>
@@ -4288,236 +4162,168 @@
       <m:oMathPara>
         <m:oMath>
           <m:r>
-            <w:ins w:id="58" w:author="Mini Huang" w:date="2026-05-26T15:34:00Z">
-              <w:rPr>
-                <w:rFonts w:ascii="Cambria Math" w:hAnsi="Cambria Math"/>
-              </w:rPr>
-              <m:t>lm( R ~ c)</m:t>
-            </w:ins>
+            <w:rPr>
+              <w:rFonts w:ascii="Cambria Math" w:hAnsi="Cambria Math"/>
+            </w:rPr>
+            <m:t>lm( R ~ c)</m:t>
           </m:r>
         </m:oMath>
       </m:oMathPara>
     </w:p>
     <w:p>
       <w:pPr>
-        <w:jc w:val="center"/>
-        <w:rPr>
-          <w:del w:id="59" w:author="Mini Huang" w:date="2026-05-26T15:19:00Z"/>
-          <w:sz w:val="20"/>
-          <w:szCs w:val="21"/>
-          <w:rPrChange w:id="60" w:author="Mini Huang" w:date="2026-05-26T15:34:00Z">
-            <w:rPr>
-              <w:del w:id="61" w:author="Mini Huang" w:date="2026-05-26T15:19:00Z"/>
-              <w:shd w:val="clear" w:color="auto" w:fill="FFFF00"/>
-            </w:rPr>
-          </w:rPrChange>
-        </w:rPr>
-        <w:pPrChange w:id="62" w:author="Mini Huang" w:date="2026-05-26T15:34:00Z">
-          <w:pPr/>
-        </w:pPrChange>
-      </w:pPr>
-      <m:oMath>
-        <m:r>
-          <w:ins w:id="63" w:author="Mini Huang" w:date="2026-05-26T15:34:00Z">
+        <w:rPr>
+          <w:shd w:val="clear" w:color="auto" w:fill="FFFF00"/>
+        </w:rPr>
+      </w:pPr>
+      <m:oMathPara>
+        <m:oMath>
+          <m:r>
             <w:rPr>
               <w:rFonts w:ascii="Cambria Math" w:hAnsi="Cambria Math"/>
             </w:rPr>
             <m:t>lm( S ~ c)</m:t>
-          </w:ins>
-        </m:r>
-      </m:oMath>
-      <w:del w:id="64" w:author="Mini Huang" w:date="2026-05-26T15:19:00Z">
-        <w:r>
-          <w:rPr>
-            <w:shd w:val="clear" w:color="auto" w:fill="FFFF00"/>
-          </w:rPr>
-          <w:delText>&lt;MISSING EQUATIONS HERE&gt;</w:delText>
-        </w:r>
-      </w:del>
-    </w:p>
-    <w:p>
-      <w:pPr>
-        <w:rPr>
-          <w:ins w:id="65" w:author="Mini Huang" w:date="2026-05-26T15:34:00Z"/>
-          <w:shd w:val="clear" w:color="auto" w:fill="FFFF00"/>
-        </w:rPr>
-        <w:pPrChange w:id="66" w:author="Mo Liu" w:date="2026-05-26T11:39:00Z" w16du:dateUtc="2026-05-26T15:39:00Z">
-          <w:pPr>
-            <w:ind w:firstLine="0"/>
-            <w:jc w:val="center"/>
-          </w:pPr>
-        </w:pPrChange>
-      </w:pPr>
-    </w:p>
-    <w:p>
-      <w:r>
-        <w:t>In the above formula, replication timing denotes a vector c(1,2,3 … 10).</w:t>
-      </w:r>
-    </w:p>
-    <w:p>
-      <w:r>
-        <w:t xml:space="preserve">The replication timing trend for </w:t>
-      </w:r>
-      <w:r>
-        <w:rPr>
-          <w:rFonts w:eastAsia="SimSun" w:hint="eastAsia"/>
-        </w:rPr>
-        <w:t xml:space="preserve">an 83-type </w:t>
-      </w:r>
-      <w:r>
-        <w:t xml:space="preserve">signature was determined for both real and simulated data. An </w:t>
-      </w:r>
-      <w:r>
-        <w:rPr>
-          <w:rFonts w:eastAsia="SimSun" w:hint="eastAsia"/>
-        </w:rPr>
-        <w:t>indel</w:t>
-      </w:r>
-      <w:r>
-        <w:t xml:space="preserve"> signature was considered to be generally unaffected by replication timing if the slope m was not statistically significant from a flat line. Otherwise, with the slope m statistically significant from a flat line, an ID signature was considered to be increasing from early to late replicating regions if the slope m &gt; 0, and was considered to be decreasing from early to late replicating regions if the slope m &lt; 0. </w:t>
-      </w:r>
-    </w:p>
-    <w:p>
-      <w:pPr>
-        <w:rPr>
-          <w:ins w:id="67" w:author="Mini Huang" w:date="2026-05-26T15:36:00Z"/>
-        </w:rPr>
-      </w:pPr>
-      <w:r>
-        <w:t xml:space="preserve">If the trends of a certain </w:t>
-      </w:r>
-      <w:r>
-        <w:rPr>
-          <w:rFonts w:eastAsia="SimSun" w:hint="eastAsia"/>
-        </w:rPr>
-        <w:t>83-type</w:t>
-      </w:r>
-      <w:r>
-        <w:t xml:space="preserve"> signature for the two dataset (real and simulated data) were different, the relative trend for real data comparing the simulated data was the final trend for the </w:t>
-      </w:r>
-      <w:r>
-        <w:rPr>
-          <w:rFonts w:eastAsia="SimSun" w:hint="eastAsia"/>
-        </w:rPr>
-        <w:t>83-type</w:t>
-      </w:r>
-      <w:r>
-        <w:t xml:space="preserve"> signature. Otherwise, if the trends of a certain </w:t>
-      </w:r>
-      <w:r>
-        <w:rPr>
-          <w:rFonts w:eastAsia="SimSun" w:hint="eastAsia"/>
-        </w:rPr>
-        <w:t>83-type</w:t>
-      </w:r>
-      <w:r>
-        <w:t xml:space="preserve"> signature for the two dataset were the same, a third multiple linear regression model was fitted. </w:t>
-      </w:r>
-    </w:p>
-    <w:p>
-      <w:pPr>
-        <w:rPr>
-          <w:del w:id="68" w:author="Mo Liu" w:date="2026-05-26T11:39:00Z" w16du:dateUtc="2026-05-26T15:39:00Z"/>
-          <w:rFonts w:eastAsia="SimSun"/>
-        </w:rPr>
-      </w:pPr>
-      <m:oMathPara>
-        <m:oMath>
-          <m:r>
-            <w:ins w:id="69" w:author="Mini Huang" w:date="2026-05-26T15:36:00Z">
-              <w:rPr>
-                <w:rFonts w:ascii="Cambria Math" w:hAnsi="Cambria Math"/>
-              </w:rPr>
-              <m:t>lm( R ~ S</m:t>
-            </w:ins>
-          </m:r>
-          <m:r>
-            <w:ins w:id="70" w:author="Mini Huang" w:date="2026-05-26T16:03:00Z">
-              <w:rPr>
-                <w:rFonts w:ascii="Cambria Math" w:hAnsi="Cambria Math"/>
-              </w:rPr>
-              <m:t>+</m:t>
-            </w:ins>
-          </m:r>
-          <m:r>
-            <w:ins w:id="71" w:author="Mini Huang" w:date="2026-05-26T16:03:00Z">
-              <w:rPr>
-                <w:rFonts w:ascii="Cambria Math" w:hAnsi="Cambria Math" w:hint="eastAsia"/>
-              </w:rPr>
-              <m:t>c</m:t>
-            </w:ins>
-          </m:r>
-          <m:r>
-            <w:ins w:id="72" w:author="Mini Huang" w:date="2026-05-26T15:36:00Z">
-              <w:rPr>
-                <w:rFonts w:ascii="Cambria Math" w:hAnsi="Cambria Math"/>
-              </w:rPr>
-              <m:t>)</m:t>
-            </w:ins>
           </m:r>
         </m:oMath>
       </m:oMathPara>
     </w:p>
     <w:p>
-      <w:pPr>
-        <w:rPr>
-          <w:rFonts w:eastAsia="SimSun"/>
-        </w:rPr>
-      </w:pPr>
-      <w:r>
-        <w:t xml:space="preserve">Similarly, the final trend of an </w:t>
-      </w:r>
-      <w:r>
-        <w:rPr>
-          <w:rFonts w:eastAsia="SimSun" w:hint="eastAsia"/>
-        </w:rPr>
-        <w:t>83-type</w:t>
-      </w:r>
-      <w:r>
-        <w:t xml:space="preserve"> signature were determined by the significance of the coefficient of replication timing. If it is not significant, an </w:t>
-      </w:r>
-      <w:r>
-        <w:rPr>
-          <w:rFonts w:eastAsia="SimSun" w:hint="eastAsia"/>
-        </w:rPr>
-        <w:t>83-type</w:t>
-      </w:r>
-      <w:r>
-        <w:t xml:space="preserve"> signature was considered to be generally unaffected by replication timing. Otherwise, if the coefficient of replication timing &gt; 0, an </w:t>
-      </w:r>
-      <w:r>
-        <w:rPr>
-          <w:rFonts w:eastAsia="SimSun" w:hint="eastAsia"/>
-        </w:rPr>
-        <w:t>83-type</w:t>
-      </w:r>
-      <w:r>
-        <w:t xml:space="preserve"> signature was considered to be increasing from early to late replicating </w:t>
-      </w:r>
-      <w:r>
-        <w:lastRenderedPageBreak/>
-        <w:t xml:space="preserve">regions; if the coefficient of replication timing &lt; 0, an </w:t>
-      </w:r>
-      <w:r>
-        <w:rPr>
-          <w:rFonts w:eastAsia="SimSun" w:hint="eastAsia"/>
-        </w:rPr>
-        <w:t>83-type</w:t>
-      </w:r>
-      <w:r>
-        <w:t xml:space="preserve"> signature was considered to be decreasing from early to late replicating regions.</w:t>
+      <w:r>
+        <w:t>In the above formula, replication timing denotes a vector c(1,2,3 … 10).</w:t>
       </w:r>
     </w:p>
     <w:p>
+      <w:r>
+        <w:t xml:space="preserve">The replication timing trend for </w:t>
+      </w:r>
+      <w:r>
+        <w:rPr>
+          <w:rFonts w:eastAsia="SimSun" w:hint="eastAsia"/>
+        </w:rPr>
+        <w:t xml:space="preserve">an 83-type </w:t>
+      </w:r>
+      <w:r>
+        <w:t xml:space="preserve">signature was determined for both real and simulated data. An </w:t>
+      </w:r>
+      <w:r>
+        <w:rPr>
+          <w:rFonts w:eastAsia="SimSun" w:hint="eastAsia"/>
+        </w:rPr>
+        <w:t>indel</w:t>
+      </w:r>
+      <w:r>
+        <w:t xml:space="preserve"> signature was considered to be generally unaffected by replication timing if the slope m was not statistically significant from a flat line. Otherwise, with the slope m statistically significant from a flat line, an ID signature was considered to be increasing from early to late replicating regions if the slope m &gt; 0, and was considered to be decreasing from early to late replicating regions if the slope m &lt; 0. </w:t>
+      </w:r>
+    </w:p>
+    <w:p>
+      <w:r>
+        <w:t xml:space="preserve">If the trends of a certain </w:t>
+      </w:r>
+      <w:r>
+        <w:rPr>
+          <w:rFonts w:eastAsia="SimSun" w:hint="eastAsia"/>
+        </w:rPr>
+        <w:t>83-type</w:t>
+      </w:r>
+      <w:r>
+        <w:t xml:space="preserve"> signature for the two dataset (real and simulated data) were different, the relative trend for real data comparing the simulated data was the final trend for the </w:t>
+      </w:r>
+      <w:r>
+        <w:rPr>
+          <w:rFonts w:eastAsia="SimSun" w:hint="eastAsia"/>
+        </w:rPr>
+        <w:t>83-type</w:t>
+      </w:r>
+      <w:r>
+        <w:t xml:space="preserve"> signature. Otherwise, if the trends of a certain </w:t>
+      </w:r>
+      <w:r>
+        <w:rPr>
+          <w:rFonts w:eastAsia="SimSun" w:hint="eastAsia"/>
+        </w:rPr>
+        <w:t>83-type</w:t>
+      </w:r>
+      <w:r>
+        <w:t xml:space="preserve"> signature for the two dataset were the same, a third multiple linear regression model was fitted. </w:t>
+      </w:r>
+    </w:p>
+    <w:p>
       <w:pPr>
         <w:rPr>
           <w:rFonts w:eastAsia="SimSun"/>
         </w:rPr>
       </w:pPr>
-      <w:r>
+      <m:oMath>
+        <m:r>
+          <w:rPr>
+            <w:rFonts w:ascii="Cambria Math" w:hAnsi="Cambria Math"/>
+          </w:rPr>
+          <m:t>lm( R ~ S+</m:t>
+        </m:r>
+        <m:r>
+          <w:rPr>
+            <w:rFonts w:ascii="Cambria Math" w:hAnsi="Cambria Math" w:hint="eastAsia"/>
+          </w:rPr>
+          <m:t>c</m:t>
+        </m:r>
+        <m:r>
+          <w:rPr>
+            <w:rFonts w:ascii="Cambria Math" w:hAnsi="Cambria Math"/>
+          </w:rPr>
+          <m:t>)</m:t>
+        </m:r>
+      </m:oMath>
+      <w:r>
+        <w:t xml:space="preserve">Similarly, the final trend of an </w:t>
+      </w:r>
+      <w:r>
+        <w:rPr>
+          <w:rFonts w:eastAsia="SimSun" w:hint="eastAsia"/>
+        </w:rPr>
+        <w:t>83-type</w:t>
+      </w:r>
+      <w:r>
+        <w:t xml:space="preserve"> signature were determined by the significance of the coefficient of replication timing. If it is not significant, an </w:t>
+      </w:r>
+      <w:r>
+        <w:rPr>
+          <w:rFonts w:eastAsia="SimSun" w:hint="eastAsia"/>
+        </w:rPr>
+        <w:t>83-type</w:t>
+      </w:r>
+      <w:r>
+        <w:t xml:space="preserve"> signature was considered to be generally unaffected by replication timing. Otherwise, if the coefficient of replication timing &gt; 0, an </w:t>
+      </w:r>
+      <w:r>
+        <w:rPr>
+          <w:rFonts w:eastAsia="SimSun" w:hint="eastAsia"/>
+        </w:rPr>
+        <w:t>83-type</w:t>
+      </w:r>
+      <w:r>
+        <w:t xml:space="preserve"> signature was considered to be increasing from early to late replicating regions; if the coefficient of replication timing &lt; 0, an </w:t>
+      </w:r>
+      <w:r>
+        <w:rPr>
+          <w:rFonts w:eastAsia="SimSun" w:hint="eastAsia"/>
+        </w:rPr>
+        <w:t>83-type</w:t>
+      </w:r>
+      <w:r>
+        <w:t xml:space="preserve"> signature was considered to be decreasing from early to late replicating regions.</w:t>
+      </w:r>
+    </w:p>
+    <w:p>
+      <w:pPr>
         <w:rPr>
           <w:rFonts w:eastAsia="SimSun"/>
         </w:rPr>
+      </w:pPr>
+      <w:r>
+        <w:rPr>
+          <w:rFonts w:eastAsia="SimSun"/>
+        </w:rPr>
+        <w:lastRenderedPageBreak/>
         <w:t>For an 89-type signature, the replication timing trend was determined by real data only. A linear regression model was fitted for real mutation counts within the corresponding replication timing deciles. Same as 83-type signatures, the significance of the model and the value of the slope m determined the increasing, decreasing, flat trends.</w:t>
       </w:r>
     </w:p>
@@ -4913,7 +4719,7 @@
       <w:pPr>
         <w:pStyle w:val="Bibliography1"/>
       </w:pPr>
-      <w:bookmarkStart w:id="73" w:name="ZOTERO_BREF_LiVs887hgA47"/>
+      <w:bookmarkStart w:id="27" w:name="ZOTERO_BREF_LiVs887hgA47"/>
       <w:r>
         <w:t xml:space="preserve">Alexandrov, Ludmil B., Young Seok Ju, Kerstin Haase, et al. 2016. ‘Mutational Signatures Associated with Tobacco Smoking in Human Cancer’. </w:t>
       </w:r>
@@ -5338,7 +5144,7 @@
       <w:r>
         <w:t xml:space="preserve"> 52 (11): 1189–97. https://doi.org/10.1038/s41588-020-0692-4.</w:t>
       </w:r>
-      <w:bookmarkEnd w:id="73"/>
+      <w:bookmarkEnd w:id="27"/>
     </w:p>
     <w:p/>
     <w:p>
@@ -19054,120 +18860,61 @@
       <w:pPr>
         <w:spacing w:after="0" w:line="240" w:lineRule="auto"/>
         <w:ind w:firstLine="0"/>
-        <w:rPr>
-          <w:ins w:id="74" w:author="Mo Liu" w:date="2026-05-26T11:39:00Z" w16du:dateUtc="2026-05-26T15:39:00Z"/>
-        </w:rPr>
-      </w:pPr>
-      <w:ins w:id="75" w:author="Mo Liu" w:date="2026-05-26T11:39:00Z" w16du:dateUtc="2026-05-26T15:39:00Z">
-        <w:r>
-          <w:rPr>
-            <w:noProof/>
-          </w:rPr>
-          <w:lastRenderedPageBreak/>
-          <w:drawing>
-            <wp:inline distT="0" distB="0" distL="0" distR="0" wp14:anchorId="48A1678A" wp14:editId="3740C4F9">
-              <wp:extent cx="5934075" cy="3819525"/>
-              <wp:effectExtent l="0" t="0" r="9525" b="9525"/>
-              <wp:docPr id="1824165156" name="Picture 1"/>
-              <wp:cNvGraphicFramePr>
-                <a:graphicFrameLocks xmlns:a="http://schemas.openxmlformats.org/drawingml/2006/main" noChangeAspect="1"/>
-              </wp:cNvGraphicFramePr>
-              <a:graphic xmlns:a="http://schemas.openxmlformats.org/drawingml/2006/main">
-                <a:graphicData uri="http://schemas.openxmlformats.org/drawingml/2006/picture">
-                  <pic:pic xmlns:pic="http://schemas.openxmlformats.org/drawingml/2006/picture">
-                    <pic:nvPicPr>
-                      <pic:cNvPr id="0" name="Picture 1"/>
-                      <pic:cNvPicPr>
-                        <a:picLocks noChangeAspect="1" noChangeArrowheads="1"/>
-                      </pic:cNvPicPr>
-                    </pic:nvPicPr>
-                    <pic:blipFill>
-                      <a:blip r:embed="rId31" cstate="print">
-                        <a:extLst>
-                          <a:ext uri="{28A0092B-C50C-407E-A947-70E740481C1C}">
-                            <a14:useLocalDpi xmlns:a14="http://schemas.microsoft.com/office/drawing/2010/main" val="0"/>
-                          </a:ext>
-                        </a:extLst>
-                      </a:blip>
-                      <a:srcRect/>
-                      <a:stretch>
-                        <a:fillRect/>
-                      </a:stretch>
-                    </pic:blipFill>
-                    <pic:spPr bwMode="auto">
-                      <a:xfrm>
-                        <a:off x="0" y="0"/>
-                        <a:ext cx="5934075" cy="3819525"/>
-                      </a:xfrm>
-                      <a:prstGeom prst="rect">
-                        <a:avLst/>
-                      </a:prstGeom>
+      </w:pPr>
+      <w:r>
+        <w:rPr>
+          <w:noProof/>
+        </w:rPr>
+        <w:lastRenderedPageBreak/>
+        <w:drawing>
+          <wp:inline distT="0" distB="0" distL="0" distR="0" wp14:anchorId="48A1678A" wp14:editId="3740C4F9">
+            <wp:extent cx="5934075" cy="3819525"/>
+            <wp:effectExtent l="0" t="0" r="9525" b="9525"/>
+            <wp:docPr id="1824165156" name="Picture 1"/>
+            <wp:cNvGraphicFramePr>
+              <a:graphicFrameLocks xmlns:a="http://schemas.openxmlformats.org/drawingml/2006/main" noChangeAspect="1"/>
+            </wp:cNvGraphicFramePr>
+            <a:graphic xmlns:a="http://schemas.openxmlformats.org/drawingml/2006/main">
+              <a:graphicData uri="http://schemas.openxmlformats.org/drawingml/2006/picture">
+                <pic:pic xmlns:pic="http://schemas.openxmlformats.org/drawingml/2006/picture">
+                  <pic:nvPicPr>
+                    <pic:cNvPr id="0" name="Picture 1"/>
+                    <pic:cNvPicPr>
+                      <a:picLocks noChangeAspect="1" noChangeArrowheads="1"/>
+                    </pic:cNvPicPr>
+                  </pic:nvPicPr>
+                  <pic:blipFill>
+                    <a:blip r:embed="rId31" cstate="print">
+                      <a:extLst>
+                        <a:ext uri="{28A0092B-C50C-407E-A947-70E740481C1C}">
+                          <a14:useLocalDpi xmlns:a14="http://schemas.microsoft.com/office/drawing/2010/main" val="0"/>
+                        </a:ext>
+                      </a:extLst>
+                    </a:blip>
+                    <a:srcRect/>
+                    <a:stretch>
+                      <a:fillRect/>
+                    </a:stretch>
+                  </pic:blipFill>
+                  <pic:spPr bwMode="auto">
+                    <a:xfrm>
+                      <a:off x="0" y="0"/>
+                      <a:ext cx="5934075" cy="3819525"/>
+                    </a:xfrm>
+                    <a:prstGeom prst="rect">
+                      <a:avLst/>
+                    </a:prstGeom>
+                    <a:noFill/>
+                    <a:ln>
                       <a:noFill/>
-                      <a:ln>
-                        <a:noFill/>
-                      </a:ln>
-                    </pic:spPr>
-                  </pic:pic>
-                </a:graphicData>
-              </a:graphic>
-            </wp:inline>
-          </w:drawing>
-        </w:r>
-      </w:ins>
-    </w:p>
-    <w:p>
-      <w:pPr>
-        <w:spacing w:after="0" w:line="240" w:lineRule="auto"/>
-        <w:ind w:firstLine="0"/>
-        <w:rPr>
-          <w:del w:id="76" w:author="Mo Liu" w:date="2026-05-26T11:39:00Z" w16du:dateUtc="2026-05-26T15:39:00Z"/>
-        </w:rPr>
-      </w:pPr>
-      <w:del w:id="77" w:author="Mo Liu" w:date="2026-05-26T11:39:00Z" w16du:dateUtc="2026-05-26T15:39:00Z">
-        <w:r>
-          <w:rPr>
-            <w:noProof/>
-          </w:rPr>
-          <w:drawing>
-            <wp:inline distT="0" distB="0" distL="0" distR="0" wp14:anchorId="196B7979" wp14:editId="4B1FE854">
-              <wp:extent cx="5931535" cy="3816350"/>
-              <wp:effectExtent l="0" t="0" r="0" b="0"/>
-              <wp:docPr id="8" name="Picture 8"/>
-              <wp:cNvGraphicFramePr>
-                <a:graphicFrameLocks xmlns:a="http://schemas.openxmlformats.org/drawingml/2006/main" noChangeAspect="1"/>
-              </wp:cNvGraphicFramePr>
-              <a:graphic xmlns:a="http://schemas.openxmlformats.org/drawingml/2006/main">
-                <a:graphicData uri="http://schemas.openxmlformats.org/drawingml/2006/picture">
-                  <pic:pic xmlns:pic="http://schemas.openxmlformats.org/drawingml/2006/picture">
-                    <pic:nvPicPr>
-                      <pic:cNvPr id="8" name="Picture 8"/>
-                      <pic:cNvPicPr>
-                        <a:picLocks noChangeAspect="1" noChangeArrowheads="1"/>
-                      </pic:cNvPicPr>
-                    </pic:nvPicPr>
-                    <pic:blipFill>
-                      <a:blip r:embed="rId32"/>
-                      <a:stretch>
-                        <a:fillRect/>
-                      </a:stretch>
-                    </pic:blipFill>
-                    <pic:spPr bwMode="auto">
-                      <a:xfrm>
-                        <a:off x="0" y="0"/>
-                        <a:ext cx="5931535" cy="3816350"/>
-                      </a:xfrm>
-                      <a:prstGeom prst="rect">
-                        <a:avLst/>
-                      </a:prstGeom>
-                      <a:noFill/>
-                    </pic:spPr>
-                  </pic:pic>
-                </a:graphicData>
-              </a:graphic>
-            </wp:inline>
-          </w:drawing>
-        </w:r>
-      </w:del>
+                    </a:ln>
+                  </pic:spPr>
+                </pic:pic>
+              </a:graphicData>
+            </a:graphic>
+          </wp:inline>
+        </w:drawing>
+      </w:r>
     </w:p>
     <w:p>
       <w:pPr>
@@ -19344,7 +19091,6 @@
           <w:sz w:val="18"/>
           <w:szCs w:val="18"/>
         </w:rPr>
-        <w:lastRenderedPageBreak/>
         <w:t xml:space="preserve">(C) </w:t>
       </w:r>
       <w:r>
@@ -19380,37 +19126,12 @@
           <w:szCs w:val="22"/>
         </w:rPr>
       </w:pPr>
-      <w:ins w:id="78" w:author="Mo Liu" w:date="2026-05-26T11:39:00Z" w16du:dateUtc="2026-05-26T15:39:00Z">
-        <w:r>
-          <w:fldChar w:fldCharType="begin"/>
-        </w:r>
-        <w:r>
-          <w:instrText>LINK Excel.Sheet.12 "C:\\Users\\lmliu\\Downloads\\table_1_autogenerated (1).xlsx" "Sheet1!R1C1:R23C6" \a \f 5 \h  \* MERGEFORMAT</w:instrText>
-        </w:r>
-        <w:r>
-          <w:fldChar w:fldCharType="separate"/>
-        </w:r>
-        <w:r>
-          <w:fldChar w:fldCharType="end"/>
-        </w:r>
-      </w:ins>
-      <w:del w:id="79" w:author="Mo Liu" w:date="2026-05-26T11:39:00Z" w16du:dateUtc="2026-05-26T15:39:00Z">
-        <w:r>
-          <w:fldChar w:fldCharType="begin"/>
-        </w:r>
-        <w:r>
-          <w:delInstrText>LINK Excel.Sheet.12 "C:\\Users\\lmliu\\Downloads\\table_1_autogenerated (1).xlsx" "Sheet1!R1C1:R23C6" \a \f 5 \h  \* MERGEFORMAT</w:delInstrText>
-        </w:r>
-        <w:r>
-          <w:fldChar w:fldCharType="end"/>
-        </w:r>
-      </w:del>
     </w:p>
     <w:sectPr>
-      <w:headerReference w:type="default" r:id="rId33"/>
-      <w:footerReference w:type="even" r:id="rId34"/>
-      <w:footerReference w:type="default" r:id="rId35"/>
-      <w:footerReference w:type="first" r:id="rId36"/>
+      <w:headerReference w:type="default" r:id="rId32"/>
+      <w:footerReference w:type="even" r:id="rId33"/>
+      <w:footerReference w:type="default" r:id="rId34"/>
+      <w:footerReference w:type="first" r:id="rId35"/>
       <w:pgSz w:w="12240" w:h="15840"/>
       <w:pgMar w:top="720" w:right="1440" w:bottom="1440" w:left="1440" w:header="0" w:footer="720" w:gutter="0"/>
       <w:cols w:space="720"/>
@@ -19423,7 +19144,7 @@
 
 <file path=word/comments.xml><?xml version="1.0" encoding="utf-8"?>
 <w:comments xmlns:wpc="http://schemas.microsoft.com/office/word/2010/wordprocessingCanvas" xmlns:cx="http://schemas.microsoft.com/office/drawing/2014/chartex" xmlns:cx1="http://schemas.microsoft.com/office/drawing/2015/9/8/chartex" xmlns:cx2="http://schemas.microsoft.com/office/drawing/2015/10/21/chartex" xmlns:cx3="http://schemas.microsoft.com/office/drawing/2016/5/9/chartex" xmlns:cx4="http://schemas.microsoft.com/office/drawing/2016/5/10/chartex" xmlns:cx5="http://schemas.microsoft.com/office/drawing/2016/5/11/chartex" xmlns:cx6="http://schemas.microsoft.com/office/drawing/2016/5/12/chartex" xmlns:cx7="http://schemas.microsoft.com/office/drawing/2016/5/13/chartex" xmlns:cx8="http://schemas.microsoft.com/office/drawing/2016/5/14/chartex" xmlns:mc="http://schemas.openxmlformats.org/markup-compatibility/2006" xmlns:aink="http://schemas.microsoft.com/office/drawing/2016/ink" xmlns:am3d="http://schemas.microsoft.com/office/drawing/2017/model3d" xmlns:o="urn:schemas-microsoft-com:office:office" xmlns:oel="http://schemas.microsoft.com/office/2019/extlst" xmlns:r="http://schemas.openxmlformats.org/officeDocument/2006/relationships" xmlns:m="http://schemas.openxmlformats.org/officeDocument/2006/math" xmlns:v="urn:schemas-microsoft-com:vml" xmlns:wp14="http://schemas.microsoft.com/office/word/2010/wordprocessingDrawing" xmlns:wp="http://schemas.openxmlformats.org/drawingml/2006/wordprocessingDrawing" xmlns:w10="urn:schemas-microsoft-com:office:word" xmlns:w="http://schemas.openxmlformats.org/wordprocessingml/2006/main" xmlns:w14="http://schemas.microsoft.com/office/word/2010/wordml" xmlns:w15="http://schemas.microsoft.com/office/word/2012/wordml" xmlns:w16cex="http://schemas.microsoft.com/office/word/2018/wordml/cex" xmlns:w16cid="http://schemas.microsoft.com/office/word/2016/wordml/cid" xmlns:w16="http://schemas.microsoft.com/office/word/2018/wordml" xmlns:w16du="http://schemas.microsoft.com/office/word/2023/wordml/word16du" xmlns:w16sdtdh="http://schemas.microsoft.com/office/word/2020/wordml/sdtdatahash" xmlns:w16sdtfl="http://schemas.microsoft.com/office/word/2024/wordml/sdtformatlock" xmlns:w16se="http://schemas.microsoft.com/office/word/2015/wordml/symex" xmlns:wpg="http://schemas.microsoft.com/office/word/2010/wordprocessingGroup" xmlns:wpi="http://schemas.microsoft.com/office/word/2010/wordprocessingInk" xmlns:wne="http://schemas.microsoft.com/office/word/2006/wordml" xmlns:wps="http://schemas.microsoft.com/office/word/2010/wordprocessingShape" mc:Ignorable="w14 w15 w16se w16cid w16 w16cex w16sdtdh w16sdtfl w16du wp14">
-  <w:comment w:id="20" w:author="Mo Liu" w:date="2026-05-25T16:05:00Z" w:initials="ML">
+  <w:comment w:id="13" w:author="Mo Liu" w:date="2026-05-25T16:05:00Z" w:initials="ML">
     <w:p>
       <w:pPr>
         <w:spacing w:after="0" w:line="240" w:lineRule="auto"/>
@@ -19441,7 +19162,7 @@
       </w:r>
     </w:p>
   </w:comment>
-  <w:comment w:id="19" w:author="Mo Liu" w:date="2026-05-25T16:05:00Z" w:initials="ML">
+  <w:comment w:id="12" w:author="Mo Liu" w:date="2026-05-25T16:05:00Z" w:initials="ML">
     <w:p>
       <w:pPr>
         <w:spacing w:after="0" w:line="240" w:lineRule="auto"/>
@@ -19459,7 +19180,7 @@
       </w:r>
     </w:p>
   </w:comment>
-  <w:comment w:id="29" w:author="Mo Liu" w:date="2026-05-16T08:47:00Z" w:initials="ML">
+  <w:comment w:id="20" w:author="Mo Liu" w:date="2026-05-16T08:47:00Z" w:initials="ML">
     <w:p>
       <w:pPr>
         <w:spacing w:after="0" w:line="240" w:lineRule="auto"/>
@@ -19477,7 +19198,7 @@
       </w:r>
     </w:p>
   </w:comment>
-  <w:comment w:id="28" w:author="Mo Liu" w:date="2026-05-16T08:47:00Z" w:initials="ML">
+  <w:comment w:id="19" w:author="Mo Liu" w:date="2026-05-16T08:47:00Z" w:initials="ML">
     <w:p>
       <w:pPr>
         <w:spacing w:after="0" w:line="240" w:lineRule="auto"/>
@@ -19495,7 +19216,7 @@
       </w:r>
     </w:p>
   </w:comment>
-  <w:comment w:id="31" w:author="Mo Liu" w:date="2026-05-20T09:26:00Z" w:initials="ML">
+  <w:comment w:id="22" w:author="Mo Liu" w:date="2026-05-20T09:26:00Z" w:initials="ML">
     <w:p>
       <w:pPr>
         <w:spacing w:after="0" w:line="240" w:lineRule="auto"/>
@@ -19513,7 +19234,7 @@
       </w:r>
     </w:p>
   </w:comment>
-  <w:comment w:id="30" w:author="Mo Liu" w:date="2026-05-20T09:26:00Z" w:initials="ML">
+  <w:comment w:id="21" w:author="Mo Liu" w:date="2026-05-20T09:26:00Z" w:initials="ML">
     <w:p>
       <w:pPr>
         <w:spacing w:after="0" w:line="240" w:lineRule="auto"/>
@@ -19531,7 +19252,7 @@
       </w:r>
     </w:p>
   </w:comment>
-  <w:comment w:id="33" w:author="Mo Liu" w:date="2026-05-26T08:41:00Z" w:initials="ML">
+  <w:comment w:id="24" w:author="Mo Liu" w:date="2026-05-26T08:41:00Z" w:initials="ML">
     <w:p>
       <w:pPr>
         <w:pStyle w:val="CommentText"/>
@@ -19548,7 +19269,7 @@
       </w:r>
     </w:p>
   </w:comment>
-  <w:comment w:id="36" w:author="Mo Liu" w:date="2026-05-25T13:45:00Z" w:initials="ML">
+  <w:comment w:id="26" w:author="Mo Liu" w:date="2026-05-25T13:45:00Z" w:initials="ML">
     <w:p>
       <w:pPr>
         <w:spacing w:after="0" w:line="240" w:lineRule="auto"/>
@@ -19566,7 +19287,7 @@
       </w:r>
     </w:p>
   </w:comment>
-  <w:comment w:id="35" w:author="Mo Liu" w:date="2026-05-25T13:45:00Z" w:initials="ML">
+  <w:comment w:id="25" w:author="Mo Liu" w:date="2026-05-25T13:45:00Z" w:initials="ML">
     <w:p>
       <w:pPr>
         <w:spacing w:after="0" w:line="240" w:lineRule="auto"/>
@@ -20592,9 +20313,6 @@
 <w15:people xmlns:wpc="http://schemas.microsoft.com/office/word/2010/wordprocessingCanvas" xmlns:cx="http://schemas.microsoft.com/office/drawing/2014/chartex" xmlns:cx1="http://schemas.microsoft.com/office/drawing/2015/9/8/chartex" xmlns:cx2="http://schemas.microsoft.com/office/drawing/2015/10/21/chartex" xmlns:cx3="http://schemas.microsoft.com/office/drawing/2016/5/9/chartex" xmlns:cx4="http://schemas.microsoft.com/office/drawing/2016/5/10/chartex" xmlns:cx5="http://schemas.microsoft.com/office/drawing/2016/5/11/chartex" xmlns:cx6="http://schemas.microsoft.com/office/drawing/2016/5/12/chartex" xmlns:cx7="http://schemas.microsoft.com/office/drawing/2016/5/13/chartex" xmlns:cx8="http://schemas.microsoft.com/office/drawing/2016/5/14/chartex" xmlns:mc="http://schemas.openxmlformats.org/markup-compatibility/2006" xmlns:aink="http://schemas.microsoft.com/office/drawing/2016/ink" xmlns:am3d="http://schemas.microsoft.com/office/drawing/2017/model3d" xmlns:o="urn:schemas-microsoft-com:office:office" xmlns:oel="http://schemas.microsoft.com/office/2019/extlst" xmlns:r="http://schemas.openxmlformats.org/officeDocument/2006/relationships" xmlns:m="http://schemas.openxmlformats.org/officeDocument/2006/math" xmlns:v="urn:schemas-microsoft-com:vml" xmlns:wp14="http://schemas.microsoft.com/office/word/2010/wordprocessingDrawing" xmlns:wp="http://schemas.openxmlformats.org/drawingml/2006/wordprocessingDrawing" xmlns:w10="urn:schemas-microsoft-com:office:word" xmlns:w="http://schemas.openxmlformats.org/wordprocessingml/2006/main" xmlns:w14="http://schemas.microsoft.com/office/word/2010/wordml" xmlns:w15="http://schemas.microsoft.com/office/word/2012/wordml" xmlns:w16cex="http://schemas.microsoft.com/office/word/2018/wordml/cex" xmlns:w16cid="http://schemas.microsoft.com/office/word/2016/wordml/cid" xmlns:w16="http://schemas.microsoft.com/office/word/2018/wordml" xmlns:w16du="http://schemas.microsoft.com/office/word/2023/wordml/word16du" xmlns:w16sdtdh="http://schemas.microsoft.com/office/word/2020/wordml/sdtdatahash" xmlns:w16sdtfl="http://schemas.microsoft.com/office/word/2024/wordml/sdtformatlock" xmlns:w16se="http://schemas.microsoft.com/office/word/2015/wordml/symex" xmlns:wpg="http://schemas.microsoft.com/office/word/2010/wordprocessingGroup" xmlns:wpi="http://schemas.microsoft.com/office/word/2010/wordprocessingInk" xmlns:wne="http://schemas.microsoft.com/office/word/2006/wordml" xmlns:wps="http://schemas.microsoft.com/office/word/2010/wordprocessingShape" mc:Ignorable="w14 w15 w16se w16cid w16 w16cex w16sdtdh w16sdtfl w16du wp14">
   <w15:person w15:author="Mo Liu">
     <w15:presenceInfo w15:providerId="Windows Live" w15:userId="e9c7212a1ac174da"/>
-  </w15:person>
-  <w15:person w15:author="Mini Huang">
-    <w15:presenceInfo w15:providerId="Windows Live" w15:userId="5d44a38bec6127de"/>
   </w15:person>
 </w15:people>
 </file>

</xml_diff>